<commit_message>
Keep Pi calls on C20 audio and retry while hardware wakes
</commit_message>
<xml_diff>
--- a/docs/terminal_config.docx
+++ b/docs/terminal_config.docx
@@ -833,10 +833,7 @@
     </w:p>
     <w:p>
       <w:r>
-        <w:rPr>
-          <w:b w:val="0"/>
-        </w:rPr>
-        <w:t>The terminal serial is shown at the bottom of Settings. The server also offers camera/audio configuration, video resolution and frame rate. Fresh video settings are 720p at 15 fps; higher targets depend on the camera, Pi and network. Media changes may wait until the current call ends.</w:t>
+        <w:t>The terminal serial is shown at the bottom of Settings. The Nuroum C20 automatically supplies the camera, microphone and speaker; there are no other device choices. If it is still waking, the terminal retries once per second and waits before connecting the call. You can still press red to cancel. Sound never switches to the TV. The server offers video resolution, frame rate, audio processing and C20 volume. Fresh video settings are 720p at 15 fps; media changes may wait until the call ends.</w:t>
       </w:r>
     </w:p>
     <w:p>

</xml_diff>

<commit_message>
Keep Pi calls on C20 and retry while it wakes (#7)
* Keep Pi calls on C20 audio and retry while hardware wakes

* Review trace links and prepare release 0.3.11

---------

Co-authored-by: acolin <11369231+toastfr35@users.noreply.github.com>
</commit_message>
<xml_diff>
--- a/docs/terminal_config.docx
+++ b/docs/terminal_config.docx
@@ -833,10 +833,7 @@
     </w:p>
     <w:p>
       <w:r>
-        <w:rPr>
-          <w:b w:val="0"/>
-        </w:rPr>
-        <w:t>The terminal serial is shown at the bottom of Settings. The server also offers camera/audio configuration, video resolution and frame rate. Fresh video settings are 720p at 15 fps; higher targets depend on the camera, Pi and network. Media changes may wait until the current call ends.</w:t>
+        <w:t>The terminal serial is shown at the bottom of Settings. The Nuroum C20 automatically supplies the camera, microphone and speaker; there are no other device choices. If it is still waking, the terminal retries once per second and waits before connecting the call. You can still press red to cancel. Sound never switches to the TV. The server offers video resolution, frame rate, audio processing and C20 volume. Fresh video settings are 720p at 15 fps; media changes may wait until the call ends.</w:t>
       </w:r>
     </w:p>
     <w:p>

</xml_diff>

<commit_message>
Add positioning guides to terminal QR previews
</commit_message>
<xml_diff>
--- a/docs/terminal_config.docx
+++ b/docs/terminal_config.docx
@@ -251,10 +251,7 @@
     </w:p>
     <w:p>
       <w:r>
-        <w:rPr>
-          <w:b w:val="0"/>
-        </w:rPr>
-        <w:t>Hold the Wi-Fi QR steadily in front of the C20, with the whole code visible. Wait for success and the ten-second confirmation. When the server QR screen appears, show the server QR. An incorrect or unreachable server leaves an error and lets you try again.</w:t>
+        <w:t>Hold the Wi-Fi QR steadily in front of the C20, with the whole code inside the four corner guides shown on the TV. Move the code closer or farther away until it fits clearly. Wait for success and the ten-second confirmation. When the server QR screen appears, show the server QR inside the same guides. An incorrect or unreachable server leaves an error and lets you try again.</w:t>
       </w:r>
     </w:p>
     <w:p>

</xml_diff>

<commit_message>
Confirm Settings exit and wrap ringtone choices
</commit_message>
<xml_diff>
--- a/docs/terminal_config.docx
+++ b/docs/terminal_config.docx
@@ -411,10 +411,7 @@
     </w:p>
     <w:p>
       <w:r>
-        <w:rPr>
-          <w:b w:val="0"/>
-        </w:rPr>
-        <w:t>Use left and right to select a setting. Green opens it. Inside the setting, left and right change the option or value, green saves and red discards the change. Red from the list leaves Settings. Saved changes are sent back to the server; if saving fails, leave the error visible and retry after restoring the connection.</w:t>
+        <w:t>Use left/right to choose a setting; green opens it. Inside, left/right changes the draft, green saves and red discards it. Red on the list asks to exit: green confirms; red stays. Saved changes go to the server. If saving fails, retry after restoring the connection.</w:t>
       </w:r>
     </w:p>
     <w:tbl>
@@ -857,7 +854,7 @@
     </w:p>
     <w:p>
       <w:r>
-        <w:t>To choose a ringtone, open Ringtone in Settings with green. Use left and right to hear each choice through the C20 at the current speaker volume; a preview plays for up to ten seconds after a short pause. A waking C20 may take a moment. At zero volume the preview is silent. Press green to save, or red to cancel. An incoming call stops the preview. Nokia remains available if a new sound has not downloaded yet. The administrator can add sounds on the server.</w:t>
+        <w:t>To choose a ringtone, open Ringtone in Settings with green. Use left and right to browse and hear each choice through the C20; the list wraps at both ends. A preview plays for up to ten seconds after a short pause. A waking C20 may take a moment. At zero volume the preview is silent. Press green to save, or red to cancel. An incoming call stops the preview. Nokia remains available if a new sound has not downloaded yet. The administrator can add sounds on the server.</w:t>
       </w:r>
     </w:p>
     <w:p>

</xml_diff>

<commit_message>
Adjust Settings speaker volume in five-percent steps
</commit_message>
<xml_diff>
--- a/docs/terminal_config.docx
+++ b/docs/terminal_config.docx
@@ -696,15 +696,8 @@
             </w:tcMar>
           </w:tcPr>
           <w:p>
-            <w:pPr>
-              <w:spacing w:after="0" w:line="252" w:lineRule="auto"/>
-            </w:pPr>
             <w:r>
-              <w:rPr>
-                <w:b w:val="0"/>
-                <w:sz w:val="23"/>
-              </w:rPr>
-              <w:t>0 to 100 percent</w:t>
+              <w:t>0–100%, in steps of 5%</w:t>
             </w:r>
           </w:p>
         </w:tc>

</xml_diff>

<commit_message>
Improve terminal callback prompts, flags and volume controls
</commit_message>
<xml_diff>
--- a/docs/terminal_config.docx
+++ b/docs/terminal_config.docx
@@ -403,10 +403,7 @@
     </w:p>
     <w:p>
       <w:r>
-        <w:rPr>
-          <w:b w:val="0"/>
-        </w:rPr>
-        <w:t>From the contact carousel, hold red for ten seconds. A progress bar appears after two seconds. Keep holding until Settings opens. Releasing early cancels the gesture.</w:t>
+        <w:t>From the contact carousel, hold red for seven seconds. A progress bar appears after two seconds. Keep holding until Settings opens. Releasing early cancels the gesture.</w:t>
       </w:r>
     </w:p>
     <w:p>
@@ -696,7 +693,14 @@
             </w:tcMar>
           </w:tcPr>
           <w:p>
+            <w:pPr>
+              <w:spacing w:after="0" w:line="252" w:lineRule="auto"/>
+            </w:pPr>
             <w:r>
+              <w:rPr>
+                <w:b w:val="0"/>
+                <w:sz w:val="23"/>
+              </w:rPr>
               <w:t>0–100%, in steps of 5%</w:t>
             </w:r>
           </w:p>

</xml_diff>

<commit_message>
Separate terminal sound levels and prioritize remote feedback
</commit_message>
<xml_diff>
--- a/docs/terminal_config.docx
+++ b/docs/terminal_config.docx
@@ -256,10 +256,7 @@
     </w:p>
     <w:p>
       <w:r>
-        <w:rPr>
-          <w:b w:val="0"/>
-        </w:rPr>
-        <w:t>Setup starts in English. The language selected on the server takes effect after enrollment. Some detailed recovery instructions fall back to English.</w:t>
+        <w:t>Setup starts in English. After enrollment, Language in Settings offers 16 native-language labels in alphabetic order, wrapping at both ends. The same list is on the server. An older unsupported choice falls back to English on upgrade. Detailed help may use English fallback.</w:t>
       </w:r>
     </w:p>
     <w:p>
@@ -668,15 +665,8 @@
             </w:tcMar>
           </w:tcPr>
           <w:p>
-            <w:pPr>
-              <w:spacing w:after="0" w:line="252" w:lineRule="auto"/>
-            </w:pPr>
             <w:r>
-              <w:rPr>
-                <w:b w:val="0"/>
-                <w:sz w:val="23"/>
-              </w:rPr>
-              <w:t>Speaker volume</w:t>
+              <w:t>Ringtone volume</w:t>
             </w:r>
           </w:p>
         </w:tc>
@@ -693,15 +683,49 @@
             </w:tcMar>
           </w:tcPr>
           <w:p>
-            <w:pPr>
-              <w:spacing w:after="0" w:line="252" w:lineRule="auto"/>
-            </w:pPr>
             <w:r>
-              <w:rPr>
-                <w:b w:val="0"/>
-                <w:sz w:val="23"/>
-              </w:rPr>
-              <w:t>0–100%, in steps of 5%</w:t>
+              <w:t>0-100%, in 5% steps; separate from call volume</w:t>
+            </w:r>
+          </w:p>
+        </w:tc>
+      </w:tr>
+      <w:tr>
+        <w:trPr>
+          <w:cantSplit/>
+        </w:trPr>
+        <w:tc>
+          <w:tcPr>
+            <w:tcW w:type="dxa" w:w="2376"/>
+            <w:vAlign w:val="center"/>
+            <w:shd w:fill="F7F9FB"/>
+            <w:tcMar>
+              <w:top w:w="110" w:type="dxa"/>
+              <w:bottom w:w="110" w:type="dxa"/>
+              <w:left w:w="110" w:type="dxa"/>
+              <w:right w:w="110" w:type="dxa"/>
+            </w:tcMar>
+          </w:tcPr>
+          <w:p>
+            <w:r>
+              <w:t>Button sounds volume</w:t>
+            </w:r>
+          </w:p>
+        </w:tc>
+        <w:tc>
+          <w:tcPr>
+            <w:tcW w:type="dxa" w:w="7128"/>
+            <w:vAlign w:val="center"/>
+            <w:shd w:fill="F7F9FB"/>
+            <w:tcMar>
+              <w:top w:w="110" w:type="dxa"/>
+              <w:bottom w:w="110" w:type="dxa"/>
+              <w:left w:w="110" w:type="dxa"/>
+              <w:right w:w="110" w:type="dxa"/>
+            </w:tcMar>
+          </w:tcPr>
+          <w:p>
+            <w:r>
+              <w:t>0-100%, in 5% steps; quiet during calls and ringing</w:t>
             </w:r>
           </w:p>
         </w:tc>
@@ -851,7 +875,7 @@
     </w:p>
     <w:p>
       <w:r>
-        <w:t>To choose a ringtone, open Ringtone in Settings with green. Use left and right to browse and hear each choice through the C20; the list wraps at both ends. A preview plays for up to ten seconds after a short pause. A waking C20 may take a moment. At zero volume the preview is silent. Press green to save, or red to cancel. An incoming call stops the preview. Nokia remains available if a new sound has not downloaded yet. The administrator can add sounds on the server.</w:t>
+        <w:t>To choose a ringtone, open Ringtone in Settings with green. Left/right browses the list, wrapping at either end, and previews through the C20 at Ringtone volume after a short pause, for up to ten seconds. Ringtone volume can be adjusted separately with the same preview. Green saves after server confirmation; red cancels. A waking C20 may take a moment. A call or leaving the editor stops the preview. Nokia remains available offline.</w:t>
       </w:r>
     </w:p>
     <w:p>

</xml_diff>

<commit_message>
Route normal calls through guarded TV plugin and record hardware findings
</commit_message>
<xml_diff>
--- a/docs/terminal_config.docx
+++ b/docs/terminal_config.docx
@@ -388,11 +388,19 @@
       </w:r>
     </w:p>
     <w:p>
+      <w:pPr>
+        <w:keepLines/>
+      </w:pPr>
       <w:r>
-        <w:rPr>
-          <w:b w:val="0"/>
-        </w:rPr>
         <w:t>For Samsung, follow the on-screen Anynet+ and Network Control instructions. Select the correct TV if several are found, and approve its ZmalaCall permission prompt using the TV remote. For Sony BRAVIA, check BRAVIA Sync and TV auto power on. Menu wording varies; physical Sony operation has not yet been verified by this project.</w:t>
+      </w:r>
+    </w:p>
+    <w:p>
+      <w:pPr>
+        <w:keepLines/>
+      </w:pPr>
+      <w:r>
+        <w:t>If Samsung shows “Check Device Power”, first confirm the HDMI port and cable. Check Connected Devices or Source: the Pi must not be configured as an old cable or satellite box, such as Sky. In Universal remote setup, remove only the obsolete box profile assigned to the Pi’s HDMI port. Leave other devices alone. Repeat the TV setup checks and a call from both standby and live TV.</w:t>
       </w:r>
     </w:p>
     <w:p>

</xml_diff>